<commit_message>
fix: stabilize backend container, workflow pipeline, RAG services, health checks, and dependencies
</commit_message>
<xml_diff>
--- a/backend/export/outputs/word/test_user_stories.docx
+++ b/backend/export/outputs/word/test_user_stories.docx
@@ -32,7 +32,7 @@
           <w:i/>
           <w:sz w:val="20"/>
         </w:rPr>
-        <w:t>Generated: 2026-07-10 05:34:48 UTC</w:t>
+        <w:t>Generated: 2026-07-15 13:24:10 UTC</w:t>
       </w:r>
     </w:p>
     <w:p>
@@ -301,143 +301,6 @@
         <w:pStyle w:val="Heading2"/>
       </w:pPr>
       <w:r>
-        <w:t>📜 Business Rules</w:t>
-      </w:r>
-    </w:p>
-    <w:p>
-      <w:pPr>
-        <w:pStyle w:val="ListBullet"/>
-        <w:ind w:left="360"/>
-      </w:pPr>
-      <w:r>
-        <w:t>Email must be in valid format (RFC 5322)</w:t>
-      </w:r>
-    </w:p>
-    <w:p>
-      <w:pPr>
-        <w:pStyle w:val="ListBullet"/>
-        <w:ind w:left="360"/>
-      </w:pPr>
-      <w:r>
-        <w:t>Password must be at least 8 characters</w:t>
-      </w:r>
-    </w:p>
-    <w:p>
-      <w:pPr>
-        <w:pStyle w:val="ListBullet"/>
-        <w:ind w:left="360"/>
-      </w:pPr>
-      <w:r>
-        <w:t>Account locks after 5 failed attempts</w:t>
-      </w:r>
-    </w:p>
-    <w:p>
-      <w:pPr>
-        <w:pStyle w:val="ListBullet"/>
-        <w:ind w:left="360"/>
-      </w:pPr>
-      <w:r>
-        <w:t>Session expires after 30 minutes of inactivity</w:t>
-      </w:r>
-    </w:p>
-    <w:p>
-      <w:pPr>
-        <w:pStyle w:val="Heading2"/>
-      </w:pPr>
-      <w:r>
-        <w:t>🔗 Dependencies</w:t>
-      </w:r>
-    </w:p>
-    <w:tbl>
-      <w:tblPr>
-        <w:tblStyle w:val="LightList-Accent1"/>
-        <w:tblW w:type="auto" w:w="0"/>
-        <w:tblLook w:firstColumn="1" w:firstRow="1" w:lastColumn="0" w:lastRow="0" w:noHBand="0" w:noVBand="1" w:val="04A0"/>
-      </w:tblPr>
-      <w:tblGrid>
-        <w:gridCol w:w="2880"/>
-        <w:gridCol w:w="2880"/>
-        <w:gridCol w:w="2880"/>
-      </w:tblGrid>
-      <w:tr>
-        <w:tc>
-          <w:tcPr>
-            <w:tcW w:type="dxa" w:w="2880"/>
-          </w:tcPr>
-          <w:p>
-            <w:r>
-              <w:rPr>
-                <w:b/>
-              </w:rPr>
-              <w:t>Dependency ID</w:t>
-            </w:r>
-          </w:p>
-        </w:tc>
-        <w:tc>
-          <w:tcPr>
-            <w:tcW w:type="dxa" w:w="2880"/>
-          </w:tcPr>
-          <w:p>
-            <w:r>
-              <w:rPr>
-                <w:b/>
-              </w:rPr>
-              <w:t>Type</w:t>
-            </w:r>
-          </w:p>
-        </w:tc>
-        <w:tc>
-          <w:tcPr>
-            <w:tcW w:type="dxa" w:w="2880"/>
-          </w:tcPr>
-          <w:p>
-            <w:r>
-              <w:rPr>
-                <w:b/>
-              </w:rPr>
-              <w:t>Description</w:t>
-            </w:r>
-          </w:p>
-        </w:tc>
-      </w:tr>
-      <w:tr>
-        <w:tc>
-          <w:tcPr>
-            <w:tcW w:type="dxa" w:w="2880"/>
-          </w:tcPr>
-          <w:p>
-            <w:r>
-              <w:t>US-002</w:t>
-            </w:r>
-          </w:p>
-        </w:tc>
-        <w:tc>
-          <w:tcPr>
-            <w:tcW w:type="dxa" w:w="2880"/>
-          </w:tcPr>
-          <w:p>
-            <w:r>
-              <w:t>blocks</w:t>
-            </w:r>
-          </w:p>
-        </w:tc>
-        <w:tc>
-          <w:tcPr>
-            <w:tcW w:type="dxa" w:w="2880"/>
-          </w:tcPr>
-          <w:p>
-            <w:r>
-              <w:t>Depends on US-002</w:t>
-            </w:r>
-          </w:p>
-        </w:tc>
-      </w:tr>
-    </w:tbl>
-    <w:p>
-      <w:pPr>
-        <w:pStyle w:val="Heading2"/>
-      </w:pPr>
-      <w:r>
         <w:t>⚠️ Risks</w:t>
       </w:r>
     </w:p>
@@ -483,50 +346,6 @@
       </w:pPr>
       <w:r>
         <w:t>Browser supports HTML5</w:t>
-      </w:r>
-    </w:p>
-    <w:p>
-      <w:pPr>
-        <w:pStyle w:val="Heading2"/>
-      </w:pPr>
-      <w:r>
-        <w:t>✔️ Definition of Done</w:t>
-      </w:r>
-    </w:p>
-    <w:p>
-      <w:pPr>
-        <w:pStyle w:val="ListBullet"/>
-        <w:ind w:left="360"/>
-      </w:pPr>
-      <w:r>
-        <w:t>Code reviewed</w:t>
-      </w:r>
-    </w:p>
-    <w:p>
-      <w:pPr>
-        <w:pStyle w:val="ListBullet"/>
-        <w:ind w:left="360"/>
-      </w:pPr>
-      <w:r>
-        <w:t>Unit tests passed</w:t>
-      </w:r>
-    </w:p>
-    <w:p>
-      <w:pPr>
-        <w:pStyle w:val="ListBullet"/>
-        <w:ind w:left="360"/>
-      </w:pPr>
-      <w:r>
-        <w:t>Integration tests passed</w:t>
-      </w:r>
-    </w:p>
-    <w:p>
-      <w:pPr>
-        <w:pStyle w:val="ListBullet"/>
-        <w:ind w:left="360"/>
-      </w:pPr>
-      <w:r>
-        <w:t>Deployed to staging</w:t>
       </w:r>
     </w:p>
     <w:p>
@@ -592,7 +411,7 @@
           </w:tcPr>
           <w:p>
             <w:r>
-              <w:t>2026-07-10 05:34:48</w:t>
+              <w:t>2026-07-15 13:24:10</w:t>
             </w:r>
           </w:p>
         </w:tc>
@@ -743,31 +562,6 @@
           <w:p>
             <w:r>
               <w:t>3 chunks</w:t>
-            </w:r>
-          </w:p>
-        </w:tc>
-      </w:tr>
-      <w:tr>
-        <w:tc>
-          <w:tcPr>
-            <w:tcW w:type="dxa" w:w="4320"/>
-          </w:tcPr>
-          <w:p>
-            <w:r>
-              <w:rPr>
-                <w:b/>
-              </w:rPr>
-              <w:t>Requirements</w:t>
-            </w:r>
-          </w:p>
-        </w:tc>
-        <w:tc>
-          <w:tcPr>
-            <w:tcW w:type="dxa" w:w="4320"/>
-          </w:tcPr>
-          <w:p>
-            <w:r>
-              <w:t>REQ-001, REQ-002</w:t>
             </w:r>
           </w:p>
         </w:tc>
@@ -1021,50 +815,6 @@
         <w:pStyle w:val="Heading2"/>
       </w:pPr>
       <w:r>
-        <w:t>📜 Business Rules</w:t>
-      </w:r>
-    </w:p>
-    <w:p>
-      <w:pPr>
-        <w:pStyle w:val="ListBullet"/>
-        <w:ind w:left="360"/>
-      </w:pPr>
-      <w:r>
-        <w:t>Reset link expires after 24 hours</w:t>
-      </w:r>
-    </w:p>
-    <w:p>
-      <w:pPr>
-        <w:pStyle w:val="ListBullet"/>
-        <w:ind w:left="360"/>
-      </w:pPr>
-      <w:r>
-        <w:t>New password must be different from last 3 passwords</w:t>
-      </w:r>
-    </w:p>
-    <w:p>
-      <w:pPr>
-        <w:pStyle w:val="ListBullet"/>
-        <w:ind w:left="360"/>
-      </w:pPr>
-      <w:r>
-        <w:t>Email must be verified before reset</w:t>
-      </w:r>
-    </w:p>
-    <w:p>
-      <w:pPr>
-        <w:pStyle w:val="ListBullet"/>
-        <w:ind w:left="360"/>
-      </w:pPr>
-      <w:r>
-        <w:t>Rate limit: 3 reset requests per hour</w:t>
-      </w:r>
-    </w:p>
-    <w:p>
-      <w:pPr>
-        <w:pStyle w:val="Heading2"/>
-      </w:pPr>
-      <w:r>
         <w:t>⚠️ Risks</w:t>
       </w:r>
     </w:p>
@@ -1110,50 +860,6 @@
       </w:pPr>
       <w:r>
         <w:t>Browser supports HTML5</w:t>
-      </w:r>
-    </w:p>
-    <w:p>
-      <w:pPr>
-        <w:pStyle w:val="Heading2"/>
-      </w:pPr>
-      <w:r>
-        <w:t>✔️ Definition of Done</w:t>
-      </w:r>
-    </w:p>
-    <w:p>
-      <w:pPr>
-        <w:pStyle w:val="ListBullet"/>
-        <w:ind w:left="360"/>
-      </w:pPr>
-      <w:r>
-        <w:t>Code reviewed</w:t>
-      </w:r>
-    </w:p>
-    <w:p>
-      <w:pPr>
-        <w:pStyle w:val="ListBullet"/>
-        <w:ind w:left="360"/>
-      </w:pPr>
-      <w:r>
-        <w:t>Unit tests passed</w:t>
-      </w:r>
-    </w:p>
-    <w:p>
-      <w:pPr>
-        <w:pStyle w:val="ListBullet"/>
-        <w:ind w:left="360"/>
-      </w:pPr>
-      <w:r>
-        <w:t>Integration tests passed</w:t>
-      </w:r>
-    </w:p>
-    <w:p>
-      <w:pPr>
-        <w:pStyle w:val="ListBullet"/>
-        <w:ind w:left="360"/>
-      </w:pPr>
-      <w:r>
-        <w:t>Deployed to staging</w:t>
       </w:r>
     </w:p>
     <w:p>
@@ -1219,7 +925,7 @@
           </w:tcPr>
           <w:p>
             <w:r>
-              <w:t>2026-07-10 05:34:48</w:t>
+              <w:t>2026-07-15 13:24:10</w:t>
             </w:r>
           </w:p>
         </w:tc>
@@ -1370,31 +1076,6 @@
           <w:p>
             <w:r>
               <w:t>3 chunks</w:t>
-            </w:r>
-          </w:p>
-        </w:tc>
-      </w:tr>
-      <w:tr>
-        <w:tc>
-          <w:tcPr>
-            <w:tcW w:type="dxa" w:w="4320"/>
-          </w:tcPr>
-          <w:p>
-            <w:r>
-              <w:rPr>
-                <w:b/>
-              </w:rPr>
-              <w:t>Requirements</w:t>
-            </w:r>
-          </w:p>
-        </w:tc>
-        <w:tc>
-          <w:tcPr>
-            <w:tcW w:type="dxa" w:w="4320"/>
-          </w:tcPr>
-          <w:p>
-            <w:r>
-              <w:t>REQ-003</w:t>
             </w:r>
           </w:p>
         </w:tc>
@@ -1630,143 +1311,6 @@
         <w:pStyle w:val="Heading2"/>
       </w:pPr>
       <w:r>
-        <w:t>📜 Business Rules</w:t>
-      </w:r>
-    </w:p>
-    <w:p>
-      <w:pPr>
-        <w:pStyle w:val="ListBullet"/>
-        <w:ind w:left="360"/>
-      </w:pPr>
-      <w:r>
-        <w:t>Email address cannot be changed directly (requires verification)</w:t>
-      </w:r>
-    </w:p>
-    <w:p>
-      <w:pPr>
-        <w:pStyle w:val="ListBullet"/>
-        <w:ind w:left="360"/>
-      </w:pPr>
-      <w:r>
-        <w:t>Profile picture must be under 5MB</w:t>
-      </w:r>
-    </w:p>
-    <w:p>
-      <w:pPr>
-        <w:pStyle w:val="ListBullet"/>
-        <w:ind w:left="360"/>
-      </w:pPr>
-      <w:r>
-        <w:t>Allowed image formats: JPG, PNG, GIF</w:t>
-      </w:r>
-    </w:p>
-    <w:p>
-      <w:pPr>
-        <w:pStyle w:val="ListBullet"/>
-        <w:ind w:left="360"/>
-      </w:pPr>
-      <w:r>
-        <w:t>Phone number must be in valid format</w:t>
-      </w:r>
-    </w:p>
-    <w:p>
-      <w:pPr>
-        <w:pStyle w:val="Heading2"/>
-      </w:pPr>
-      <w:r>
-        <w:t>🔗 Dependencies</w:t>
-      </w:r>
-    </w:p>
-    <w:tbl>
-      <w:tblPr>
-        <w:tblStyle w:val="LightList-Accent1"/>
-        <w:tblW w:type="auto" w:w="0"/>
-        <w:tblLook w:firstColumn="1" w:firstRow="1" w:lastColumn="0" w:lastRow="0" w:noHBand="0" w:noVBand="1" w:val="04A0"/>
-      </w:tblPr>
-      <w:tblGrid>
-        <w:gridCol w:w="2880"/>
-        <w:gridCol w:w="2880"/>
-        <w:gridCol w:w="2880"/>
-      </w:tblGrid>
-      <w:tr>
-        <w:tc>
-          <w:tcPr>
-            <w:tcW w:type="dxa" w:w="2880"/>
-          </w:tcPr>
-          <w:p>
-            <w:r>
-              <w:rPr>
-                <w:b/>
-              </w:rPr>
-              <w:t>Dependency ID</w:t>
-            </w:r>
-          </w:p>
-        </w:tc>
-        <w:tc>
-          <w:tcPr>
-            <w:tcW w:type="dxa" w:w="2880"/>
-          </w:tcPr>
-          <w:p>
-            <w:r>
-              <w:rPr>
-                <w:b/>
-              </w:rPr>
-              <w:t>Type</w:t>
-            </w:r>
-          </w:p>
-        </w:tc>
-        <w:tc>
-          <w:tcPr>
-            <w:tcW w:type="dxa" w:w="2880"/>
-          </w:tcPr>
-          <w:p>
-            <w:r>
-              <w:rPr>
-                <w:b/>
-              </w:rPr>
-              <w:t>Description</w:t>
-            </w:r>
-          </w:p>
-        </w:tc>
-      </w:tr>
-      <w:tr>
-        <w:tc>
-          <w:tcPr>
-            <w:tcW w:type="dxa" w:w="2880"/>
-          </w:tcPr>
-          <w:p>
-            <w:r>
-              <w:t>US-001</w:t>
-            </w:r>
-          </w:p>
-        </w:tc>
-        <w:tc>
-          <w:tcPr>
-            <w:tcW w:type="dxa" w:w="2880"/>
-          </w:tcPr>
-          <w:p>
-            <w:r>
-              <w:t>blocks</w:t>
-            </w:r>
-          </w:p>
-        </w:tc>
-        <w:tc>
-          <w:tcPr>
-            <w:tcW w:type="dxa" w:w="2880"/>
-          </w:tcPr>
-          <w:p>
-            <w:r>
-              <w:t>Depends on US-001</w:t>
-            </w:r>
-          </w:p>
-        </w:tc>
-      </w:tr>
-    </w:tbl>
-    <w:p>
-      <w:pPr>
-        <w:pStyle w:val="Heading2"/>
-      </w:pPr>
-      <w:r>
         <w:t>⚠️ Risks</w:t>
       </w:r>
     </w:p>
@@ -1812,50 +1356,6 @@
       </w:pPr>
       <w:r>
         <w:t>Browser supports HTML5</w:t>
-      </w:r>
-    </w:p>
-    <w:p>
-      <w:pPr>
-        <w:pStyle w:val="Heading2"/>
-      </w:pPr>
-      <w:r>
-        <w:t>✔️ Definition of Done</w:t>
-      </w:r>
-    </w:p>
-    <w:p>
-      <w:pPr>
-        <w:pStyle w:val="ListBullet"/>
-        <w:ind w:left="360"/>
-      </w:pPr>
-      <w:r>
-        <w:t>Code reviewed</w:t>
-      </w:r>
-    </w:p>
-    <w:p>
-      <w:pPr>
-        <w:pStyle w:val="ListBullet"/>
-        <w:ind w:left="360"/>
-      </w:pPr>
-      <w:r>
-        <w:t>Unit tests passed</w:t>
-      </w:r>
-    </w:p>
-    <w:p>
-      <w:pPr>
-        <w:pStyle w:val="ListBullet"/>
-        <w:ind w:left="360"/>
-      </w:pPr>
-      <w:r>
-        <w:t>Integration tests passed</w:t>
-      </w:r>
-    </w:p>
-    <w:p>
-      <w:pPr>
-        <w:pStyle w:val="ListBullet"/>
-        <w:ind w:left="360"/>
-      </w:pPr>
-      <w:r>
-        <w:t>Deployed to staging</w:t>
       </w:r>
     </w:p>
     <w:p>
@@ -1921,7 +1421,7 @@
           </w:tcPr>
           <w:p>
             <w:r>
-              <w:t>2026-07-10 05:34:48</w:t>
+              <w:t>2026-07-15 13:24:10</w:t>
             </w:r>
           </w:p>
         </w:tc>
@@ -2072,31 +1572,6 @@
           <w:p>
             <w:r>
               <w:t>3 chunks</w:t>
-            </w:r>
-          </w:p>
-        </w:tc>
-      </w:tr>
-      <w:tr>
-        <w:tc>
-          <w:tcPr>
-            <w:tcW w:type="dxa" w:w="4320"/>
-          </w:tcPr>
-          <w:p>
-            <w:r>
-              <w:rPr>
-                <w:b/>
-              </w:rPr>
-              <w:t>Requirements</w:t>
-            </w:r>
-          </w:p>
-        </w:tc>
-        <w:tc>
-          <w:tcPr>
-            <w:tcW w:type="dxa" w:w="4320"/>
-          </w:tcPr>
-          <w:p>
-            <w:r>
-              <w:t>REQ-004, REQ-005</w:t>
             </w:r>
           </w:p>
         </w:tc>

</xml_diff>